<commit_message>
Markdown notebook 2 edits
</commit_message>
<xml_diff>
--- a/reports/fraud_detection_report.docx
+++ b/reports/fraud_detection_report.docx
@@ -265,6 +265,7 @@
     <w:p>
       <w:pPr>
         <w:spacing w:after="160" w:line="276" w:lineRule="auto"/>
+        <w:jc w:val="both"/>
       </w:pPr>
       <w:r>
         <w:t>This project builds and evaluates a fraud detection system for credit card transactions, with a specific focus on translating model output into real business cost rather than optimizing an abstract accuracy metric. The analysis covers 284,807 transactions, of which 492 (0.17%) are fraudulent — a level of class imbalance that shapes every methodological decision in this project, from evaluation metric choice to threshold selection.</w:t>
@@ -287,6 +288,7 @@
           <w:numId w:val="1"/>
         </w:numPr>
         <w:spacing w:after="90" w:line="276" w:lineRule="auto"/>
+        <w:jc w:val="both"/>
       </w:pPr>
       <w:r>
         <w:rPr>
@@ -312,6 +314,7 @@
           <w:numId w:val="1"/>
         </w:numPr>
         <w:spacing w:after="90" w:line="276" w:lineRule="auto"/>
+        <w:jc w:val="both"/>
       </w:pPr>
       <w:r>
         <w:rPr>
@@ -332,6 +335,7 @@
           <w:numId w:val="1"/>
         </w:numPr>
         <w:spacing w:after="90" w:line="276" w:lineRule="auto"/>
+        <w:jc w:val="both"/>
       </w:pPr>
       <w:r>
         <w:rPr>
@@ -352,6 +356,7 @@
           <w:numId w:val="1"/>
         </w:numPr>
         <w:spacing w:after="90" w:line="276" w:lineRule="auto"/>
+        <w:jc w:val="both"/>
       </w:pPr>
       <w:r>
         <w:rPr>
@@ -388,6 +393,7 @@
           <w:numId w:val="1"/>
         </w:numPr>
         <w:spacing w:after="90" w:line="276" w:lineRule="auto"/>
+        <w:jc w:val="both"/>
       </w:pPr>
       <w:r>
         <w:rPr>
@@ -460,6 +466,7 @@
     <w:p>
       <w:pPr>
         <w:spacing w:after="160" w:line="276" w:lineRule="auto"/>
+        <w:jc w:val="both"/>
       </w:pPr>
       <w:r>
         <w:t xml:space="preserve">Fraud detection is fundamentally a cost-asymmetric decision problem. A missed fraudulent transaction (false negative) directly costs the business the transaction amount, while a false alarm (false positive) costs analyst investigation time and, potentially, customer friction. Standard classification metrics — accuracy, even F1-score — do not naturally reflect this </w:t>
@@ -497,6 +504,7 @@
           <w:numId w:val="1"/>
         </w:numPr>
         <w:spacing w:after="90" w:line="276" w:lineRule="auto"/>
+        <w:jc w:val="both"/>
       </w:pPr>
       <w:r>
         <w:t>Which model best distinguishes fraud from legitimate transactions under severe class imbalance?</w:t>
@@ -510,6 +518,7 @@
           <w:numId w:val="1"/>
         </w:numPr>
         <w:spacing w:after="90" w:line="276" w:lineRule="auto"/>
+        <w:jc w:val="both"/>
       </w:pPr>
       <w:r>
         <w:t>At what decision threshold does the model minimize real financial cost, not just a generic metric?</w:t>
@@ -523,6 +532,7 @@
           <w:numId w:val="1"/>
         </w:numPr>
         <w:spacing w:after="90" w:line="276" w:lineRule="auto"/>
+        <w:jc w:val="both"/>
       </w:pPr>
       <w:r>
         <w:t>If a review team has limited capacity, how should that capacity be allocated for maximum fraud capture?</w:t>
@@ -536,6 +546,7 @@
           <w:numId w:val="1"/>
         </w:numPr>
         <w:spacing w:after="90" w:line="276" w:lineRule="auto"/>
+        <w:jc w:val="both"/>
       </w:pPr>
       <w:r>
         <w:t>Can the model's decisions be explained and trusted well enough for audit and stakeholder communication?</w:t>
@@ -602,12 +613,6 @@
         <w:gridCol w:w="6000"/>
       </w:tblGrid>
       <w:tr>
-        <w:tblPrEx>
-          <w:tblCellMar>
-            <w:top w:w="0" w:type="dxa"/>
-            <w:bottom w:w="0" w:type="dxa"/>
-          </w:tblCellMar>
-        </w:tblPrEx>
         <w:tc>
           <w:tcPr>
             <w:tcW w:w="3000" w:type="dxa"/>
@@ -658,12 +663,6 @@
         </w:tc>
       </w:tr>
       <w:tr>
-        <w:tblPrEx>
-          <w:tblCellMar>
-            <w:top w:w="0" w:type="dxa"/>
-            <w:bottom w:w="0" w:type="dxa"/>
-          </w:tblCellMar>
-        </w:tblPrEx>
         <w:tc>
           <w:tcPr>
             <w:tcW w:w="3000" w:type="dxa"/>
@@ -706,12 +705,6 @@
         </w:tc>
       </w:tr>
       <w:tr>
-        <w:tblPrEx>
-          <w:tblCellMar>
-            <w:top w:w="0" w:type="dxa"/>
-            <w:bottom w:w="0" w:type="dxa"/>
-          </w:tblCellMar>
-        </w:tblPrEx>
         <w:tc>
           <w:tcPr>
             <w:tcW w:w="3000" w:type="dxa"/>
@@ -756,12 +749,6 @@
         </w:tc>
       </w:tr>
       <w:tr>
-        <w:tblPrEx>
-          <w:tblCellMar>
-            <w:top w:w="0" w:type="dxa"/>
-            <w:bottom w:w="0" w:type="dxa"/>
-          </w:tblCellMar>
-        </w:tblPrEx>
         <w:tc>
           <w:tcPr>
             <w:tcW w:w="3000" w:type="dxa"/>
@@ -804,12 +791,6 @@
         </w:tc>
       </w:tr>
       <w:tr>
-        <w:tblPrEx>
-          <w:tblCellMar>
-            <w:top w:w="0" w:type="dxa"/>
-            <w:bottom w:w="0" w:type="dxa"/>
-          </w:tblCellMar>
-        </w:tblPrEx>
         <w:tc>
           <w:tcPr>
             <w:tcW w:w="3000" w:type="dxa"/>
@@ -854,12 +835,6 @@
         </w:tc>
       </w:tr>
       <w:tr>
-        <w:tblPrEx>
-          <w:tblCellMar>
-            <w:top w:w="0" w:type="dxa"/>
-            <w:bottom w:w="0" w:type="dxa"/>
-          </w:tblCellMar>
-        </w:tblPrEx>
         <w:tc>
           <w:tcPr>
             <w:tcW w:w="3000" w:type="dxa"/>
@@ -929,6 +904,7 @@
     <w:p>
       <w:pPr>
         <w:spacing w:after="160" w:line="276" w:lineRule="auto"/>
+        <w:jc w:val="both"/>
       </w:pPr>
       <w:r>
         <w:t>For confidentiality, 28 of the 30 features (V1–V28) are the output of a PCA transformation and cannot be interpreted in business terms — only their statistical importance can be assessed, not their real-world meaning. Time and Amount remain in their original, interpretable form, and both proved analytically valuable throughout this project (Sections 4, 8, and 9).</w:t>
@@ -1080,6 +1056,7 @@
           <w:numId w:val="1"/>
         </w:numPr>
         <w:spacing w:after="90" w:line="276" w:lineRule="auto"/>
+        <w:jc w:val="both"/>
       </w:pPr>
       <w:r>
         <w:t xml:space="preserve">Very low amounts (≤$1) show the highest fraud rate of any bin — consistent with “card-testing” </w:t>
@@ -1101,6 +1078,7 @@
           <w:numId w:val="1"/>
         </w:numPr>
         <w:spacing w:after="90" w:line="276" w:lineRule="auto"/>
+        <w:jc w:val="both"/>
       </w:pPr>
       <w:r>
         <w:t>Fraud rate drops through the $1–$60 range, dominated by ordinary legitimate spending.</w:t>
@@ -1114,6 +1092,7 @@
           <w:numId w:val="1"/>
         </w:numPr>
         <w:spacing w:after="90" w:line="276" w:lineRule="auto"/>
+        <w:jc w:val="both"/>
       </w:pPr>
       <w:r>
         <w:t xml:space="preserve">Fraud rate rises again above roughly $60–$200, consistent with “cash-out” </w:t>
@@ -1156,6 +1135,7 @@
     <w:p>
       <w:pPr>
         <w:spacing w:after="160" w:line="276" w:lineRule="auto"/>
+        <w:jc w:val="both"/>
       </w:pPr>
       <w:r>
         <w:t>Fraud rate also varies meaningfully by hour of day, with the highest-risk window falling between approximately 1am and 4am — several times the overall baseline fraud rate. This finding is used in Section 8's capacity analysis to propose a time-aware review prioritization alongside the primary transaction-volume-based recommendation.</w:t>
@@ -1289,12 +1269,6 @@
         <w:gridCol w:w="2348"/>
       </w:tblGrid>
       <w:tr>
-        <w:tblPrEx>
-          <w:tblCellMar>
-            <w:top w:w="0" w:type="dxa"/>
-            <w:bottom w:w="0" w:type="dxa"/>
-          </w:tblCellMar>
-        </w:tblPrEx>
         <w:trPr>
           <w:trHeight w:val="250"/>
         </w:trPr>
@@ -1396,12 +1370,6 @@
         </w:tc>
       </w:tr>
       <w:tr>
-        <w:tblPrEx>
-          <w:tblCellMar>
-            <w:top w:w="0" w:type="dxa"/>
-            <w:bottom w:w="0" w:type="dxa"/>
-          </w:tblCellMar>
-        </w:tblPrEx>
         <w:trPr>
           <w:trHeight w:val="250"/>
         </w:trPr>
@@ -1487,12 +1455,6 @@
         </w:tc>
       </w:tr>
       <w:tr>
-        <w:tblPrEx>
-          <w:tblCellMar>
-            <w:top w:w="0" w:type="dxa"/>
-            <w:bottom w:w="0" w:type="dxa"/>
-          </w:tblCellMar>
-        </w:tblPrEx>
         <w:trPr>
           <w:trHeight w:val="500"/>
         </w:trPr>
@@ -1582,12 +1544,6 @@
         </w:tc>
       </w:tr>
       <w:tr>
-        <w:tblPrEx>
-          <w:tblCellMar>
-            <w:top w:w="0" w:type="dxa"/>
-            <w:bottom w:w="0" w:type="dxa"/>
-          </w:tblCellMar>
-        </w:tblPrEx>
         <w:trPr>
           <w:trHeight w:val="508"/>
         </w:trPr>
@@ -1745,12 +1701,6 @@
         <w:gridCol w:w="3139"/>
       </w:tblGrid>
       <w:tr>
-        <w:tblPrEx>
-          <w:tblCellMar>
-            <w:top w:w="0" w:type="dxa"/>
-            <w:bottom w:w="0" w:type="dxa"/>
-          </w:tblCellMar>
-        </w:tblPrEx>
         <w:trPr>
           <w:trHeight w:val="260"/>
         </w:trPr>
@@ -1828,12 +1778,6 @@
         </w:tc>
       </w:tr>
       <w:tr>
-        <w:tblPrEx>
-          <w:tblCellMar>
-            <w:top w:w="0" w:type="dxa"/>
-            <w:bottom w:w="0" w:type="dxa"/>
-          </w:tblCellMar>
-        </w:tblPrEx>
         <w:trPr>
           <w:trHeight w:val="260"/>
         </w:trPr>
@@ -1901,12 +1845,6 @@
         </w:tc>
       </w:tr>
       <w:tr>
-        <w:tblPrEx>
-          <w:tblCellMar>
-            <w:top w:w="0" w:type="dxa"/>
-            <w:bottom w:w="0" w:type="dxa"/>
-          </w:tblCellMar>
-        </w:tblPrEx>
         <w:trPr>
           <w:trHeight w:val="260"/>
         </w:trPr>
@@ -1975,12 +1913,6 @@
         </w:tc>
       </w:tr>
       <w:tr>
-        <w:tblPrEx>
-          <w:tblCellMar>
-            <w:top w:w="0" w:type="dxa"/>
-            <w:bottom w:w="0" w:type="dxa"/>
-          </w:tblCellMar>
-        </w:tblPrEx>
         <w:trPr>
           <w:trHeight w:val="267"/>
         </w:trPr>
@@ -2064,6 +1996,7 @@
     <w:p>
       <w:pPr>
         <w:spacing w:after="160" w:line="276" w:lineRule="auto"/>
+        <w:jc w:val="both"/>
       </w:pPr>
       <w:r>
         <w:t xml:space="preserve">Tree-based ensemble models (Random Forest and </w:t>
@@ -2123,6 +2056,7 @@
     <w:p>
       <w:pPr>
         <w:spacing w:after="160" w:line="276" w:lineRule="auto"/>
+        <w:jc w:val="both"/>
       </w:pPr>
       <w:r>
         <w:t xml:space="preserve">An earlier iteration of this tuning step applied SMOTE oversampling to the training data once, upfront, before cross-validation splitting. This produced cross-validated PR-AUC scores </w:t>
@@ -2139,6 +2073,7 @@
     <w:p>
       <w:pPr>
         <w:spacing w:after="160" w:line="276" w:lineRule="auto"/>
+        <w:jc w:val="both"/>
       </w:pPr>
       <w:r>
         <w:t>Investigation traced this to a specific and well-documented pitfall: because SMOTE generates synthetic minority-class points by interpolating between real fraud cases that are close together in feature space, applying it before cross-validation splitting means a synthetic point and its real “parent” fraud case can land in different cross-validation folds. The model then effectively validates against near-duplicates of what it just trained on, inflating the cross-validated score without reflecting genuine ability to generalize to unseen fraud patterns.</w:t>
@@ -2147,6 +2082,7 @@
     <w:p>
       <w:pPr>
         <w:spacing w:after="160" w:line="276" w:lineRule="auto"/>
+        <w:jc w:val="both"/>
       </w:pPr>
       <w:r>
         <w:t>The correction was to restructure SMOTE as a step inside an imbalanced-learn pipeline object, ensuring resampling is fit fresh within each fold's training portion only, with no synthetic point able to influence the corresponding held-out fold. This is the standard, correct approach for combining SMOTE with cross-validation. Following the fix, cross-validated PR-AUC scores fell to a realistic 0.840 (Random Forest) and 0.848 (</w:t>
@@ -2199,12 +2135,6 @@
         <w:gridCol w:w="3000"/>
       </w:tblGrid>
       <w:tr>
-        <w:tblPrEx>
-          <w:tblCellMar>
-            <w:top w:w="0" w:type="dxa"/>
-            <w:bottom w:w="0" w:type="dxa"/>
-          </w:tblCellMar>
-        </w:tblPrEx>
         <w:tc>
           <w:tcPr>
             <w:tcW w:w="3000" w:type="dxa"/>
@@ -2279,12 +2209,6 @@
         </w:tc>
       </w:tr>
       <w:tr>
-        <w:tblPrEx>
-          <w:tblCellMar>
-            <w:top w:w="0" w:type="dxa"/>
-            <w:bottom w:w="0" w:type="dxa"/>
-          </w:tblCellMar>
-        </w:tblPrEx>
         <w:tc>
           <w:tcPr>
             <w:tcW w:w="3000" w:type="dxa"/>
@@ -2349,12 +2273,6 @@
         </w:tc>
       </w:tr>
       <w:tr>
-        <w:tblPrEx>
-          <w:tblCellMar>
-            <w:top w:w="0" w:type="dxa"/>
-            <w:bottom w:w="0" w:type="dxa"/>
-          </w:tblCellMar>
-        </w:tblPrEx>
         <w:tc>
           <w:tcPr>
             <w:tcW w:w="3000" w:type="dxa"/>
@@ -2627,12 +2545,6 @@
         <w:gridCol w:w="3000"/>
       </w:tblGrid>
       <w:tr>
-        <w:tblPrEx>
-          <w:tblCellMar>
-            <w:top w:w="0" w:type="dxa"/>
-            <w:bottom w:w="0" w:type="dxa"/>
-          </w:tblCellMar>
-        </w:tblPrEx>
         <w:tc>
           <w:tcPr>
             <w:tcW w:w="3000" w:type="dxa"/>
@@ -2707,12 +2619,6 @@
         </w:tc>
       </w:tr>
       <w:tr>
-        <w:tblPrEx>
-          <w:tblCellMar>
-            <w:top w:w="0" w:type="dxa"/>
-            <w:bottom w:w="0" w:type="dxa"/>
-          </w:tblCellMar>
-        </w:tblPrEx>
         <w:tc>
           <w:tcPr>
             <w:tcW w:w="3000" w:type="dxa"/>
@@ -2777,12 +2683,6 @@
         </w:tc>
       </w:tr>
       <w:tr>
-        <w:tblPrEx>
-          <w:tblCellMar>
-            <w:top w:w="0" w:type="dxa"/>
-            <w:bottom w:w="0" w:type="dxa"/>
-          </w:tblCellMar>
-        </w:tblPrEx>
         <w:tc>
           <w:tcPr>
             <w:tcW w:w="3000" w:type="dxa"/>
@@ -2967,6 +2867,7 @@
     <w:p>
       <w:pPr>
         <w:spacing w:after="160" w:line="276" w:lineRule="auto"/>
+        <w:jc w:val="both"/>
       </w:pPr>
       <w:r>
         <w:t>With the model and threshold fixed using validation data alone, a single evaluation was performed on the previously untouched test set — the one honest, decision-uninfluenced measurement of real-world performance for this project.</w:t>
@@ -2994,12 +2895,6 @@
         <w:gridCol w:w="4500"/>
       </w:tblGrid>
       <w:tr>
-        <w:tblPrEx>
-          <w:tblCellMar>
-            <w:top w:w="0" w:type="dxa"/>
-            <w:bottom w:w="0" w:type="dxa"/>
-          </w:tblCellMar>
-        </w:tblPrEx>
         <w:tc>
           <w:tcPr>
             <w:tcW w:w="4500" w:type="dxa"/>
@@ -3050,12 +2945,6 @@
         </w:tc>
       </w:tr>
       <w:tr>
-        <w:tblPrEx>
-          <w:tblCellMar>
-            <w:top w:w="0" w:type="dxa"/>
-            <w:bottom w:w="0" w:type="dxa"/>
-          </w:tblCellMar>
-        </w:tblPrEx>
         <w:tc>
           <w:tcPr>
             <w:tcW w:w="4500" w:type="dxa"/>
@@ -3100,12 +2989,6 @@
         </w:tc>
       </w:tr>
       <w:tr>
-        <w:tblPrEx>
-          <w:tblCellMar>
-            <w:top w:w="0" w:type="dxa"/>
-            <w:bottom w:w="0" w:type="dxa"/>
-          </w:tblCellMar>
-        </w:tblPrEx>
         <w:tc>
           <w:tcPr>
             <w:tcW w:w="4500" w:type="dxa"/>
@@ -3150,12 +3033,6 @@
         </w:tc>
       </w:tr>
       <w:tr>
-        <w:tblPrEx>
-          <w:tblCellMar>
-            <w:top w:w="0" w:type="dxa"/>
-            <w:bottom w:w="0" w:type="dxa"/>
-          </w:tblCellMar>
-        </w:tblPrEx>
         <w:tc>
           <w:tcPr>
             <w:tcW w:w="4500" w:type="dxa"/>
@@ -3198,12 +3075,6 @@
         </w:tc>
       </w:tr>
       <w:tr>
-        <w:tblPrEx>
-          <w:tblCellMar>
-            <w:top w:w="0" w:type="dxa"/>
-            <w:bottom w:w="0" w:type="dxa"/>
-          </w:tblCellMar>
-        </w:tblPrEx>
         <w:tc>
           <w:tcPr>
             <w:tcW w:w="4500" w:type="dxa"/>
@@ -3248,12 +3119,6 @@
         </w:tc>
       </w:tr>
       <w:tr>
-        <w:tblPrEx>
-          <w:tblCellMar>
-            <w:top w:w="0" w:type="dxa"/>
-            <w:bottom w:w="0" w:type="dxa"/>
-          </w:tblCellMar>
-        </w:tblPrEx>
         <w:tc>
           <w:tcPr>
             <w:tcW w:w="4500" w:type="dxa"/>
@@ -3296,12 +3161,6 @@
         </w:tc>
       </w:tr>
       <w:tr>
-        <w:tblPrEx>
-          <w:tblCellMar>
-            <w:top w:w="0" w:type="dxa"/>
-            <w:bottom w:w="0" w:type="dxa"/>
-          </w:tblCellMar>
-        </w:tblPrEx>
         <w:tc>
           <w:tcPr>
             <w:tcW w:w="4500" w:type="dxa"/>
@@ -3498,6 +3357,7 @@
     <w:p>
       <w:pPr>
         <w:spacing w:after="160" w:line="276" w:lineRule="auto"/>
+        <w:jc w:val="both"/>
       </w:pPr>
       <w:r>
         <w:t xml:space="preserve">A decision threshold </w:t>
@@ -3543,12 +3403,6 @@
         <w:gridCol w:w="2250"/>
       </w:tblGrid>
       <w:tr>
-        <w:tblPrEx>
-          <w:tblCellMar>
-            <w:top w:w="0" w:type="dxa"/>
-            <w:bottom w:w="0" w:type="dxa"/>
-          </w:tblCellMar>
-        </w:tblPrEx>
         <w:tc>
           <w:tcPr>
             <w:tcW w:w="2250" w:type="dxa"/>
@@ -3647,12 +3501,6 @@
         </w:tc>
       </w:tr>
       <w:tr>
-        <w:tblPrEx>
-          <w:tblCellMar>
-            <w:top w:w="0" w:type="dxa"/>
-            <w:bottom w:w="0" w:type="dxa"/>
-          </w:tblCellMar>
-        </w:tblPrEx>
         <w:tc>
           <w:tcPr>
             <w:tcW w:w="2250" w:type="dxa"/>
@@ -3735,12 +3583,6 @@
         </w:tc>
       </w:tr>
       <w:tr>
-        <w:tblPrEx>
-          <w:tblCellMar>
-            <w:top w:w="0" w:type="dxa"/>
-            <w:bottom w:w="0" w:type="dxa"/>
-          </w:tblCellMar>
-        </w:tblPrEx>
         <w:tc>
           <w:tcPr>
             <w:tcW w:w="2250" w:type="dxa"/>
@@ -3827,12 +3669,6 @@
         </w:tc>
       </w:tr>
       <w:tr>
-        <w:tblPrEx>
-          <w:tblCellMar>
-            <w:top w:w="0" w:type="dxa"/>
-            <w:bottom w:w="0" w:type="dxa"/>
-          </w:tblCellMar>
-        </w:tblPrEx>
         <w:tc>
           <w:tcPr>
             <w:tcW w:w="2250" w:type="dxa"/>
@@ -3915,12 +3751,6 @@
         </w:tc>
       </w:tr>
       <w:tr>
-        <w:tblPrEx>
-          <w:tblCellMar>
-            <w:top w:w="0" w:type="dxa"/>
-            <w:bottom w:w="0" w:type="dxa"/>
-          </w:tblCellMar>
-        </w:tblPrEx>
         <w:tc>
           <w:tcPr>
             <w:tcW w:w="2250" w:type="dxa"/>
@@ -4103,6 +3933,7 @@
     <w:p>
       <w:pPr>
         <w:spacing w:after="160" w:line="276" w:lineRule="auto"/>
+        <w:jc w:val="both"/>
       </w:pPr>
       <w:r>
         <w:t xml:space="preserve">Fraud risk is highly concentrated at the top of the model's ranked probability scores: reviewing just 0.5% of transactions already captures 89.8% of all fraud. Expanding the review budget tenfold, to 5%, only increases capture to 92.9% — a clear diminishing-returns pattern with direct staffing implications: a fraud team does not need to review a large share of transactions to catch </w:t>
@@ -4129,6 +3960,7 @@
     <w:p>
       <w:pPr>
         <w:spacing w:after="160" w:line="276" w:lineRule="auto"/>
+        <w:jc w:val="both"/>
       </w:pPr>
       <w:r>
         <w:t>Combining the hourly fraud-rate pattern from Section 4.3 with the capacity analysis above: if review capacity is limited, prioritizing alerts during the historically higher-risk overnight window (approximately 1am–4am) would concentrate review effort where it is statistically most likely to catch fraud, complementing the volume-based recommendation with a time-based dimension.</w:t>
@@ -4309,6 +4141,7 @@
     <w:p>
       <w:pPr>
         <w:spacing w:after="160" w:line="276" w:lineRule="auto"/>
+        <w:jc w:val="both"/>
       </w:pPr>
       <w:r>
         <w:t>Because V1–V28 are anonymized PCA components, their real-world business meaning cannot be stated — only their statistical importance. V14 and V4 are recommended as priority features for future drift monitoring: a meaningful shift in their distribution in production data would be an early warning that the model's core decision logic may no longer reflect current fraud patterns.</w:t>
@@ -4354,12 +4187,6 @@
         <w:gridCol w:w="3000"/>
       </w:tblGrid>
       <w:tr>
-        <w:tblPrEx>
-          <w:tblCellMar>
-            <w:top w:w="0" w:type="dxa"/>
-            <w:bottom w:w="0" w:type="dxa"/>
-          </w:tblCellMar>
-        </w:tblPrEx>
         <w:tc>
           <w:tcPr>
             <w:tcW w:w="3000" w:type="dxa"/>
@@ -4423,12 +4250,6 @@
         </w:tc>
       </w:tr>
       <w:tr>
-        <w:tblPrEx>
-          <w:tblCellMar>
-            <w:top w:w="0" w:type="dxa"/>
-            <w:bottom w:w="0" w:type="dxa"/>
-          </w:tblCellMar>
-        </w:tblPrEx>
         <w:tc>
           <w:tcPr>
             <w:tcW w:w="3000" w:type="dxa"/>
@@ -4491,12 +4312,6 @@
         </w:tc>
       </w:tr>
       <w:tr>
-        <w:tblPrEx>
-          <w:tblCellMar>
-            <w:top w:w="0" w:type="dxa"/>
-            <w:bottom w:w="0" w:type="dxa"/>
-          </w:tblCellMar>
-        </w:tblPrEx>
         <w:tc>
           <w:tcPr>
             <w:tcW w:w="3000" w:type="dxa"/>
@@ -4562,12 +4377,6 @@
         </w:tc>
       </w:tr>
       <w:tr>
-        <w:tblPrEx>
-          <w:tblCellMar>
-            <w:top w:w="0" w:type="dxa"/>
-            <w:bottom w:w="0" w:type="dxa"/>
-          </w:tblCellMar>
-        </w:tblPrEx>
         <w:tc>
           <w:tcPr>
             <w:tcW w:w="3000" w:type="dxa"/>
@@ -4769,10 +4578,17 @@
     </w:p>
     <w:p>
       <w:pPr>
+        <w:spacing w:after="160" w:line="276" w:lineRule="auto"/>
+        <w:jc w:val="both"/>
+      </w:pPr>
+    </w:p>
+    <w:p>
+      <w:pPr>
         <w:pStyle w:val="Heading2"/>
         <w:spacing w:before="300" w:after="150"/>
       </w:pPr>
       <w:r>
+        <w:lastRenderedPageBreak/>
         <w:t>8.3 Benchmarking Against an Unsupervised Approach</w:t>
       </w:r>
     </w:p>
@@ -4782,7 +4598,6 @@
         <w:jc w:val="both"/>
       </w:pPr>
       <w:r>
-        <w:lastRenderedPageBreak/>
         <w:t xml:space="preserve">As a supplementary investigation, an Isolation Forest model — trained with no fraud labels at all — was evaluated as a proxy for a “cold-start” scenario where </w:t>
       </w:r>
       <w:proofErr w:type="spellStart"/>
@@ -4817,12 +4632,6 @@
         <w:gridCol w:w="3000"/>
       </w:tblGrid>
       <w:tr>
-        <w:tblPrEx>
-          <w:tblCellMar>
-            <w:top w:w="0" w:type="dxa"/>
-            <w:bottom w:w="0" w:type="dxa"/>
-          </w:tblCellMar>
-        </w:tblPrEx>
         <w:tc>
           <w:tcPr>
             <w:tcW w:w="3000" w:type="dxa"/>
@@ -4897,12 +4706,6 @@
         </w:tc>
       </w:tr>
       <w:tr>
-        <w:tblPrEx>
-          <w:tblCellMar>
-            <w:top w:w="0" w:type="dxa"/>
-            <w:bottom w:w="0" w:type="dxa"/>
-          </w:tblCellMar>
-        </w:tblPrEx>
         <w:tc>
           <w:tcPr>
             <w:tcW w:w="3000" w:type="dxa"/>
@@ -4974,12 +4777,6 @@
         </w:tc>
       </w:tr>
       <w:tr>
-        <w:tblPrEx>
-          <w:tblCellMar>
-            <w:top w:w="0" w:type="dxa"/>
-            <w:bottom w:w="0" w:type="dxa"/>
-          </w:tblCellMar>
-        </w:tblPrEx>
         <w:tc>
           <w:tcPr>
             <w:tcW w:w="3000" w:type="dxa"/>
@@ -5063,6 +4860,7 @@
     <w:p>
       <w:pPr>
         <w:spacing w:after="160" w:line="276" w:lineRule="auto"/>
+        <w:jc w:val="both"/>
       </w:pPr>
       <w:r>
         <w:t xml:space="preserve">The supervised model catches 2.5x more fraud while generating 9x fewer false alarms. Isolation Forest has no notion of “fraud” specifically — it flags any statistically unusual transaction, which inevitably includes legitimate but atypical spending alongside genuine fraud. Unsupervised anomaly detection remains a reasonable fallback in a genuine cold-start scenario, but this comparison quantifies a real, substantial cost to operating without </w:t>
@@ -5121,12 +4919,6 @@
         <w:gridCol w:w="4500"/>
       </w:tblGrid>
       <w:tr>
-        <w:tblPrEx>
-          <w:tblCellMar>
-            <w:top w:w="0" w:type="dxa"/>
-            <w:bottom w:w="0" w:type="dxa"/>
-          </w:tblCellMar>
-        </w:tblPrEx>
         <w:tc>
           <w:tcPr>
             <w:tcW w:w="4500" w:type="dxa"/>
@@ -5177,12 +4969,6 @@
         </w:tc>
       </w:tr>
       <w:tr>
-        <w:tblPrEx>
-          <w:tblCellMar>
-            <w:top w:w="0" w:type="dxa"/>
-            <w:bottom w:w="0" w:type="dxa"/>
-          </w:tblCellMar>
-        </w:tblPrEx>
         <w:tc>
           <w:tcPr>
             <w:tcW w:w="4500" w:type="dxa"/>
@@ -5225,12 +5011,6 @@
         </w:tc>
       </w:tr>
       <w:tr>
-        <w:tblPrEx>
-          <w:tblCellMar>
-            <w:top w:w="0" w:type="dxa"/>
-            <w:bottom w:w="0" w:type="dxa"/>
-          </w:tblCellMar>
-        </w:tblPrEx>
         <w:tc>
           <w:tcPr>
             <w:tcW w:w="4500" w:type="dxa"/>
@@ -5275,12 +5055,6 @@
         </w:tc>
       </w:tr>
       <w:tr>
-        <w:tblPrEx>
-          <w:tblCellMar>
-            <w:top w:w="0" w:type="dxa"/>
-            <w:bottom w:w="0" w:type="dxa"/>
-          </w:tblCellMar>
-        </w:tblPrEx>
         <w:tc>
           <w:tcPr>
             <w:tcW w:w="4500" w:type="dxa"/>
@@ -5360,12 +5134,6 @@
         <w:gridCol w:w="4500"/>
       </w:tblGrid>
       <w:tr>
-        <w:tblPrEx>
-          <w:tblCellMar>
-            <w:top w:w="0" w:type="dxa"/>
-            <w:bottom w:w="0" w:type="dxa"/>
-          </w:tblCellMar>
-        </w:tblPrEx>
         <w:tc>
           <w:tcPr>
             <w:tcW w:w="4500" w:type="dxa"/>
@@ -5416,12 +5184,6 @@
         </w:tc>
       </w:tr>
       <w:tr>
-        <w:tblPrEx>
-          <w:tblCellMar>
-            <w:top w:w="0" w:type="dxa"/>
-            <w:bottom w:w="0" w:type="dxa"/>
-          </w:tblCellMar>
-        </w:tblPrEx>
         <w:tc>
           <w:tcPr>
             <w:tcW w:w="4500" w:type="dxa"/>
@@ -5464,12 +5226,6 @@
         </w:tc>
       </w:tr>
       <w:tr>
-        <w:tblPrEx>
-          <w:tblCellMar>
-            <w:top w:w="0" w:type="dxa"/>
-            <w:bottom w:w="0" w:type="dxa"/>
-          </w:tblCellMar>
-        </w:tblPrEx>
         <w:tc>
           <w:tcPr>
             <w:tcW w:w="4500" w:type="dxa"/>
@@ -5514,12 +5270,6 @@
         </w:tc>
       </w:tr>
       <w:tr>
-        <w:tblPrEx>
-          <w:tblCellMar>
-            <w:top w:w="0" w:type="dxa"/>
-            <w:bottom w:w="0" w:type="dxa"/>
-          </w:tblCellMar>
-        </w:tblPrEx>
         <w:tc>
           <w:tcPr>
             <w:tcW w:w="4500" w:type="dxa"/>
@@ -5562,12 +5312,6 @@
         </w:tc>
       </w:tr>
       <w:tr>
-        <w:tblPrEx>
-          <w:tblCellMar>
-            <w:top w:w="0" w:type="dxa"/>
-            <w:bottom w:w="0" w:type="dxa"/>
-          </w:tblCellMar>
-        </w:tblPrEx>
         <w:tc>
           <w:tcPr>
             <w:tcW w:w="4500" w:type="dxa"/>
@@ -5667,6 +5411,7 @@
           <w:numId w:val="1"/>
         </w:numPr>
         <w:spacing w:after="90" w:line="276" w:lineRule="auto"/>
+        <w:jc w:val="both"/>
       </w:pPr>
       <w:r>
         <w:rPr>
@@ -5687,6 +5432,7 @@
           <w:numId w:val="1"/>
         </w:numPr>
         <w:spacing w:after="90" w:line="276" w:lineRule="auto"/>
+        <w:jc w:val="both"/>
       </w:pPr>
       <w:r>
         <w:rPr>
@@ -5707,6 +5453,7 @@
           <w:numId w:val="1"/>
         </w:numPr>
         <w:spacing w:after="90" w:line="276" w:lineRule="auto"/>
+        <w:jc w:val="both"/>
       </w:pPr>
       <w:r>
         <w:rPr>
@@ -5727,6 +5474,7 @@
           <w:numId w:val="1"/>
         </w:numPr>
         <w:spacing w:after="90" w:line="276" w:lineRule="auto"/>
+        <w:jc w:val="both"/>
       </w:pPr>
       <w:r>
         <w:rPr>
@@ -5747,6 +5495,7 @@
           <w:numId w:val="1"/>
         </w:numPr>
         <w:spacing w:after="90" w:line="276" w:lineRule="auto"/>
+        <w:jc w:val="both"/>
       </w:pPr>
       <w:r>
         <w:rPr>
@@ -5757,15 +5506,6 @@
       </w:r>
       <w:r>
         <w:t>the annual cost figure represents residual cost under the deployed model; a full cost-benefit case would compare this against the cost of having no fraud detection system at all.</w:t>
-      </w:r>
-    </w:p>
-    <w:p>
-      <w:pPr>
-        <w:pStyle w:val="Heading2"/>
-        <w:spacing w:before="300" w:after="150"/>
-      </w:pPr>
-      <w:r>
-        <w:t>Future Work</w:t>
       </w:r>
     </w:p>
     <w:p>
@@ -5776,24 +5516,26 @@
           <w:numId w:val="1"/>
         </w:numPr>
         <w:spacing w:after="90" w:line="276" w:lineRule="auto"/>
+        <w:jc w:val="both"/>
       </w:pPr>
       <w:r>
         <w:rPr>
           <w:b/>
           <w:bCs/>
         </w:rPr>
-        <w:t xml:space="preserve">Segment-specific models: </w:t>
-      </w:r>
-      <w:r>
-        <w:t xml:space="preserve">the U-shaped fraud-by-amount pattern (Section 4.2) suggests low-value (card-testing) and high-value (cash-out) fraud may represent distinct </w:t>
-      </w:r>
-      <w:proofErr w:type="spellStart"/>
-      <w:r>
-        <w:t>behavioral</w:t>
-      </w:r>
-      <w:proofErr w:type="spellEnd"/>
-      <w:r>
-        <w:t xml:space="preserve"> patterns. Whether separate models per value segment, or value-aware thresholds, would outperform a single unified model is a candidate for further investigation, though the limited number of fraud cases (492 total) constrains how robustly this could be tested with the current dataset.</w:t>
+        <w:t>Ambiguous real-world hour labels:</w:t>
+      </w:r>
+      <w:r>
+        <w:t xml:space="preserve"> hour-of-day labels (e.g., "2am") are relative to the dataset's first recorded transaction, whose actual real-world clock time is not disclosed by the data source. The cyclical 24-hour fraud-rate pattern itself is genuine and reproducible, but the specific hour labels should be interpreted as positions within a recurring cycle rather than confirmed real-world clock times.</w:t>
+      </w:r>
+    </w:p>
+    <w:p>
+      <w:pPr>
+        <w:pStyle w:val="Heading2"/>
+        <w:spacing w:before="300" w:after="150"/>
+      </w:pPr>
+      <w:r>
+        <w:t>Future Work</w:t>
       </w:r>
     </w:p>
     <w:p>
@@ -5804,16 +5546,25 @@
           <w:numId w:val="1"/>
         </w:numPr>
         <w:spacing w:after="90" w:line="276" w:lineRule="auto"/>
+        <w:jc w:val="both"/>
       </w:pPr>
       <w:r>
         <w:rPr>
           <w:b/>
           <w:bCs/>
         </w:rPr>
-        <w:t xml:space="preserve">Probability calibration: </w:t>
-      </w:r>
-      <w:r>
-        <w:t>this project's cost analysis depends on model probability outputs being meaningfully comparable across thresholds. A formal calibration check (e.g., reliability diagrams) was not performed and would add further rigor.</w:t>
+        <w:t xml:space="preserve">Segment-specific models: </w:t>
+      </w:r>
+      <w:r>
+        <w:t xml:space="preserve">the U-shaped fraud-by-amount pattern (Section 4.2) suggests low-value (card-testing) and high-value (cash-out) fraud may represent distinct </w:t>
+      </w:r>
+      <w:proofErr w:type="spellStart"/>
+      <w:r>
+        <w:t>behavioral</w:t>
+      </w:r>
+      <w:proofErr w:type="spellEnd"/>
+      <w:r>
+        <w:t xml:space="preserve"> patterns. Whether separate models per value segment, or value-aware thresholds, would outperform a single unified model is a candidate for further investigation, though the limited number of fraud cases (492 total) constrains how robustly this could be tested with the current dataset.</w:t>
       </w:r>
     </w:p>
     <w:p>
@@ -5824,16 +5575,17 @@
           <w:numId w:val="1"/>
         </w:numPr>
         <w:spacing w:after="90" w:line="276" w:lineRule="auto"/>
+        <w:jc w:val="both"/>
       </w:pPr>
       <w:r>
         <w:rPr>
           <w:b/>
           <w:bCs/>
         </w:rPr>
-        <w:t xml:space="preserve">Temporal generalization: </w:t>
-      </w:r>
-      <w:r>
-        <w:t>testing model performance on chronologically later data, rather than a random split, would give a stronger signal on whether performance holds as fraud patterns evolve — though the ~48-hour window of this dataset limits how meaningful this test could be.</w:t>
+        <w:t xml:space="preserve">Probability calibration: </w:t>
+      </w:r>
+      <w:r>
+        <w:t>this project's cost analysis depends on model probability outputs being meaningfully comparable across thresholds. A formal calibration check (e.g., reliability diagrams) was not performed and would add further rigor.</w:t>
       </w:r>
     </w:p>
     <w:p>
@@ -5844,6 +5596,28 @@
           <w:numId w:val="1"/>
         </w:numPr>
         <w:spacing w:after="90" w:line="276" w:lineRule="auto"/>
+        <w:jc w:val="both"/>
+      </w:pPr>
+      <w:r>
+        <w:rPr>
+          <w:b/>
+          <w:bCs/>
+        </w:rPr>
+        <w:t xml:space="preserve">Temporal generalization: </w:t>
+      </w:r>
+      <w:r>
+        <w:t>testing model performance on chronologically later data, rather than a random split, would give a stronger signal on whether performance holds as fraud patterns evolve — though the ~48-hour window of this dataset limits how meaningful this test could be.</w:t>
+      </w:r>
+    </w:p>
+    <w:p>
+      <w:pPr>
+        <w:pStyle w:val="ListParagraph"/>
+        <w:numPr>
+          <w:ilvl w:val="0"/>
+          <w:numId w:val="1"/>
+        </w:numPr>
+        <w:spacing w:after="90" w:line="276" w:lineRule="auto"/>
+        <w:jc w:val="both"/>
       </w:pPr>
       <w:r>
         <w:rPr>
@@ -6677,7 +6451,6 @@
   <w:style w:type="character" w:default="1" w:styleId="DefaultParagraphFont">
     <w:name w:val="Default Paragraph Font"/>
     <w:uiPriority w:val="1"/>
-    <w:semiHidden/>
     <w:unhideWhenUsed/>
   </w:style>
   <w:style w:type="table" w:default="1" w:styleId="TableNormal">

</xml_diff>